<commit_message>
Correct DOS_CMD_COPY_FILE in ultimate_dos-1.1
</commit_message>
<xml_diff>
--- a/doc/ultimate_dos-1.1.docx
+++ b/doc/ultimate_dos-1.1.docx
@@ -3163,7 +3163,7 @@
         <w:rPr>
           <w:rFonts w:cs="Consolas"/>
         </w:rPr>
-        <w:t xml:space="preserve"> to the file specified by </w:t>
+        <w:t xml:space="preserve"> into the directory specified by </w:t>
       </w:r>
       <w:r>
         <w:rPr>
@@ -3179,7 +3179,7 @@
     </w:p>
     <w:p>
       <w:r>
-        <w:t xml:space="preserve">This command does not return any data. The status channel will either read </w:t>
+        <w:t xml:space="preserve">The copy keeps the name of the source file; this command cannot rename while copying. An existing file of the same name in the destination directory is not overwritten; the status channel then reports “FILE EXISTS”. This command does not return any data. The status channel will either read </w:t>
       </w:r>
       <w:r>
         <w:rPr>

</xml_diff>